<commit_message>
align thesis structure with LSU regulations
</commit_message>
<xml_diff>
--- a/chapters/abbreviations.docx
+++ b/chapters/abbreviations.docx
@@ -4,28 +4,18 @@
   <w:body>
     <w:p>
       <w:pPr>
-        <w:pStyle w:val="Heading1"/>
+        <w:spacing w:line="360" w:lineRule="auto" w:after="240"/>
+        <w:jc w:val="center"/>
       </w:pPr>
       <w:r>
         <w:rPr>
           <w:rFonts w:ascii="Times New Roman" w:hAnsi="Times New Roman"/>
+          <w:b/>
+          <w:i w:val="0"/>
           <w:color w:val="000000"/>
+          <w:sz w:val="28"/>
         </w:rPr>
         <w:t>LIST OF ABBREVIATIONS</w:t>
-      </w:r>
-    </w:p>
-    <w:p>
-      <w:pPr>
-        <w:spacing w:line="360" w:lineRule="auto"/>
-        <w:jc w:val="both"/>
-      </w:pPr>
-      <w:r>
-        <w:rPr>
-          <w:rFonts w:ascii="Times New Roman" w:hAnsi="Times New Roman"/>
-          <w:b w:val="0"/>
-          <w:i w:val="0"/>
-          <w:sz w:val="24"/>
-        </w:rPr>
       </w:r>
     </w:p>
     <w:tbl>
@@ -111,36 +101,6 @@
                 <w:rFonts w:ascii="Times New Roman" w:hAnsi="Times New Roman"/>
                 <w:sz w:val="24"/>
               </w:rPr>
-              <w:t>CDC</w:t>
-            </w:r>
-          </w:p>
-        </w:tc>
-        <w:tc>
-          <w:tcPr>
-            <w:tcW w:type="dxa" w:w="4513"/>
-          </w:tcPr>
-          <w:p>
-            <w:r>
-              <w:rPr>
-                <w:rFonts w:ascii="Times New Roman" w:hAnsi="Times New Roman"/>
-                <w:sz w:val="24"/>
-              </w:rPr>
-              <w:t>Centers for Disease Control and Prevention</w:t>
-            </w:r>
-          </w:p>
-        </w:tc>
-      </w:tr>
-      <w:tr>
-        <w:tc>
-          <w:tcPr>
-            <w:tcW w:type="dxa" w:w="4513"/>
-          </w:tcPr>
-          <w:p>
-            <w:r>
-              <w:rPr>
-                <w:rFonts w:ascii="Times New Roman" w:hAnsi="Times New Roman"/>
-                <w:sz w:val="24"/>
-              </w:rPr>
               <w:t>CI</w:t>
             </w:r>
           </w:p>
@@ -171,36 +131,6 @@
                 <w:rFonts w:ascii="Times New Roman" w:hAnsi="Times New Roman"/>
                 <w:sz w:val="24"/>
               </w:rPr>
-              <w:t>CRAAP</w:t>
-            </w:r>
-          </w:p>
-        </w:tc>
-        <w:tc>
-          <w:tcPr>
-            <w:tcW w:type="dxa" w:w="4513"/>
-          </w:tcPr>
-          <w:p>
-            <w:r>
-              <w:rPr>
-                <w:rFonts w:ascii="Times New Roman" w:hAnsi="Times New Roman"/>
-                <w:sz w:val="24"/>
-              </w:rPr>
-              <w:t>Currency, Relevance, Authority, Accuracy, Purpose</w:t>
-            </w:r>
-          </w:p>
-        </w:tc>
-      </w:tr>
-      <w:tr>
-        <w:tc>
-          <w:tcPr>
-            <w:tcW w:type="dxa" w:w="4513"/>
-          </w:tcPr>
-          <w:p>
-            <w:r>
-              <w:rPr>
-                <w:rFonts w:ascii="Times New Roman" w:hAnsi="Times New Roman"/>
-                <w:sz w:val="24"/>
-              </w:rPr>
               <w:t>DISCERN</w:t>
             </w:r>
           </w:p>
@@ -215,97 +145,7 @@
                 <w:rFonts w:ascii="Times New Roman" w:hAnsi="Times New Roman"/>
                 <w:sz w:val="24"/>
               </w:rPr>
-              <w:t>Quality criteria for consumer health information (instrument name)</w:t>
-            </w:r>
-          </w:p>
-        </w:tc>
-      </w:tr>
-      <w:tr>
-        <w:tc>
-          <w:tcPr>
-            <w:tcW w:type="dxa" w:w="4513"/>
-          </w:tcPr>
-          <w:p>
-            <w:r>
-              <w:rPr>
-                <w:rFonts w:ascii="Times New Roman" w:hAnsi="Times New Roman"/>
-                <w:sz w:val="24"/>
-              </w:rPr>
-              <w:t>eHEALS</w:t>
-            </w:r>
-          </w:p>
-        </w:tc>
-        <w:tc>
-          <w:tcPr>
-            <w:tcW w:type="dxa" w:w="4513"/>
-          </w:tcPr>
-          <w:p>
-            <w:r>
-              <w:rPr>
-                <w:rFonts w:ascii="Times New Roman" w:hAnsi="Times New Roman"/>
-                <w:sz w:val="24"/>
-              </w:rPr>
-              <w:t>eHealth Literacy Scale</w:t>
-            </w:r>
-          </w:p>
-        </w:tc>
-      </w:tr>
-      <w:tr>
-        <w:tc>
-          <w:tcPr>
-            <w:tcW w:type="dxa" w:w="4513"/>
-          </w:tcPr>
-          <w:p>
-            <w:r>
-              <w:rPr>
-                <w:rFonts w:ascii="Times New Roman" w:hAnsi="Times New Roman"/>
-                <w:sz w:val="24"/>
-              </w:rPr>
-              <w:t>GQS</w:t>
-            </w:r>
-          </w:p>
-        </w:tc>
-        <w:tc>
-          <w:tcPr>
-            <w:tcW w:type="dxa" w:w="4513"/>
-          </w:tcPr>
-          <w:p>
-            <w:r>
-              <w:rPr>
-                <w:rFonts w:ascii="Times New Roman" w:hAnsi="Times New Roman"/>
-                <w:sz w:val="24"/>
-              </w:rPr>
-              <w:t>Global Quality Scale</w:t>
-            </w:r>
-          </w:p>
-        </w:tc>
-      </w:tr>
-      <w:tr>
-        <w:tc>
-          <w:tcPr>
-            <w:tcW w:type="dxa" w:w="4513"/>
-          </w:tcPr>
-          <w:p>
-            <w:r>
-              <w:rPr>
-                <w:rFonts w:ascii="Times New Roman" w:hAnsi="Times New Roman"/>
-                <w:sz w:val="24"/>
-              </w:rPr>
-              <w:t>HONcode</w:t>
-            </w:r>
-          </w:p>
-        </w:tc>
-        <w:tc>
-          <w:tcPr>
-            <w:tcW w:type="dxa" w:w="4513"/>
-          </w:tcPr>
-          <w:p>
-            <w:r>
-              <w:rPr>
-                <w:rFonts w:ascii="Times New Roman" w:hAnsi="Times New Roman"/>
-                <w:sz w:val="24"/>
-              </w:rPr>
-              <w:t>Health on the Net Foundation Code of Conduct</w:t>
+              <w:t>Quality criteria for consumer health information instrument</w:t>
             </w:r>
           </w:p>
         </w:tc>
@@ -366,66 +206,6 @@
                 <w:sz w:val="24"/>
               </w:rPr>
               <w:t>Instagram</w:t>
-            </w:r>
-          </w:p>
-        </w:tc>
-      </w:tr>
-      <w:tr>
-        <w:tc>
-          <w:tcPr>
-            <w:tcW w:type="dxa" w:w="4513"/>
-          </w:tcPr>
-          <w:p>
-            <w:r>
-              <w:rPr>
-                <w:rFonts w:ascii="Times New Roman" w:hAnsi="Times New Roman"/>
-                <w:sz w:val="24"/>
-              </w:rPr>
-              <w:t>IQ</w:t>
-            </w:r>
-          </w:p>
-        </w:tc>
-        <w:tc>
-          <w:tcPr>
-            <w:tcW w:type="dxa" w:w="4513"/>
-          </w:tcPr>
-          <w:p>
-            <w:r>
-              <w:rPr>
-                <w:rFonts w:ascii="Times New Roman" w:hAnsi="Times New Roman"/>
-                <w:sz w:val="24"/>
-              </w:rPr>
-              <w:t>Information Quality</w:t>
-            </w:r>
-          </w:p>
-        </w:tc>
-      </w:tr>
-      <w:tr>
-        <w:tc>
-          <w:tcPr>
-            <w:tcW w:type="dxa" w:w="4513"/>
-          </w:tcPr>
-          <w:p>
-            <w:r>
-              <w:rPr>
-                <w:rFonts w:ascii="Times New Roman" w:hAnsi="Times New Roman"/>
-                <w:sz w:val="24"/>
-              </w:rPr>
-              <w:t>IQR</w:t>
-            </w:r>
-          </w:p>
-        </w:tc>
-        <w:tc>
-          <w:tcPr>
-            <w:tcW w:type="dxa" w:w="4513"/>
-          </w:tcPr>
-          <w:p>
-            <w:r>
-              <w:rPr>
-                <w:rFonts w:ascii="Times New Roman" w:hAnsi="Times New Roman"/>
-                <w:sz w:val="24"/>
-              </w:rPr>
-              <w:t>Interquartile Range</w:t>
             </w:r>
           </w:p>
         </w:tc>
@@ -531,36 +311,6 @@
                 <w:rFonts w:ascii="Times New Roman" w:hAnsi="Times New Roman"/>
                 <w:sz w:val="24"/>
               </w:rPr>
-              <w:t>NHS</w:t>
-            </w:r>
-          </w:p>
-        </w:tc>
-        <w:tc>
-          <w:tcPr>
-            <w:tcW w:type="dxa" w:w="4513"/>
-          </w:tcPr>
-          <w:p>
-            <w:r>
-              <w:rPr>
-                <w:rFonts w:ascii="Times New Roman" w:hAnsi="Times New Roman"/>
-                <w:sz w:val="24"/>
-              </w:rPr>
-              <w:t>National Health Service</w:t>
-            </w:r>
-          </w:p>
-        </w:tc>
-      </w:tr>
-      <w:tr>
-        <w:tc>
-          <w:tcPr>
-            <w:tcW w:type="dxa" w:w="4513"/>
-          </w:tcPr>
-          <w:p>
-            <w:r>
-              <w:rPr>
-                <w:rFonts w:ascii="Times New Roman" w:hAnsi="Times New Roman"/>
-                <w:sz w:val="24"/>
-              </w:rPr>
               <w:t>PA</w:t>
             </w:r>
           </w:p>
@@ -621,36 +371,6 @@
                 <w:rFonts w:ascii="Times New Roman" w:hAnsi="Times New Roman"/>
                 <w:sz w:val="24"/>
               </w:rPr>
-              <w:t>SD</w:t>
-            </w:r>
-          </w:p>
-        </w:tc>
-        <w:tc>
-          <w:tcPr>
-            <w:tcW w:type="dxa" w:w="4513"/>
-          </w:tcPr>
-          <w:p>
-            <w:r>
-              <w:rPr>
-                <w:rFonts w:ascii="Times New Roman" w:hAnsi="Times New Roman"/>
-                <w:sz w:val="24"/>
-              </w:rPr>
-              <w:t>Standard Deviation</w:t>
-            </w:r>
-          </w:p>
-        </w:tc>
-      </w:tr>
-      <w:tr>
-        <w:tc>
-          <w:tcPr>
-            <w:tcW w:type="dxa" w:w="4513"/>
-          </w:tcPr>
-          <w:p>
-            <w:r>
-              <w:rPr>
-                <w:rFonts w:ascii="Times New Roman" w:hAnsi="Times New Roman"/>
-                <w:sz w:val="24"/>
-              </w:rPr>
               <w:t>TT</w:t>
             </w:r>
           </w:p>
@@ -681,6 +401,36 @@
                 <w:rFonts w:ascii="Times New Roman" w:hAnsi="Times New Roman"/>
                 <w:sz w:val="24"/>
               </w:rPr>
+              <w:t>WEB</w:t>
+            </w:r>
+          </w:p>
+        </w:tc>
+        <w:tc>
+          <w:tcPr>
+            <w:tcW w:type="dxa" w:w="4513"/>
+          </w:tcPr>
+          <w:p>
+            <w:r>
+              <w:rPr>
+                <w:rFonts w:ascii="Times New Roman" w:hAnsi="Times New Roman"/>
+                <w:sz w:val="24"/>
+              </w:rPr>
+              <w:t>Traditional Website</w:t>
+            </w:r>
+          </w:p>
+        </w:tc>
+      </w:tr>
+      <w:tr>
+        <w:tc>
+          <w:tcPr>
+            <w:tcW w:type="dxa" w:w="4513"/>
+          </w:tcPr>
+          <w:p>
+            <w:r>
+              <w:rPr>
+                <w:rFonts w:ascii="Times New Roman" w:hAnsi="Times New Roman"/>
+                <w:sz w:val="24"/>
+              </w:rPr>
               <w:t>WHO</w:t>
             </w:r>
           </w:p>
@@ -696,36 +446,6 @@
                 <w:sz w:val="24"/>
               </w:rPr>
               <w:t>World Health Organization</w:t>
-            </w:r>
-          </w:p>
-        </w:tc>
-      </w:tr>
-      <w:tr>
-        <w:tc>
-          <w:tcPr>
-            <w:tcW w:type="dxa" w:w="4513"/>
-          </w:tcPr>
-          <w:p>
-            <w:r>
-              <w:rPr>
-                <w:rFonts w:ascii="Times New Roman" w:hAnsi="Times New Roman"/>
-                <w:sz w:val="24"/>
-              </w:rPr>
-              <w:t>WEB</w:t>
-            </w:r>
-          </w:p>
-        </w:tc>
-        <w:tc>
-          <w:tcPr>
-            <w:tcW w:type="dxa" w:w="4513"/>
-          </w:tcPr>
-          <w:p>
-            <w:r>
-              <w:rPr>
-                <w:rFonts w:ascii="Times New Roman" w:hAnsi="Times New Roman"/>
-                <w:sz w:val="24"/>
-              </w:rPr>
-              <w:t>Traditional Website</w:t>
             </w:r>
           </w:p>
         </w:tc>

</xml_diff>